<commit_message>
Şekil 1 ve dergi listesi eklendi
- Şekil 1: altı zamansal boyutun tek bir işlevsel ikame üzerinden
  uygulanması (EPS koruyucu ambalaj vs. miselyum kompozit). Her satır
  bağımsız bir sıralı eksen; kalın segment iki belirlenim arasındaki
  mesafeyi gösteriyor. 300 dpi PNG + vektör PDF.
- Şekil Bölüm 6.3'e, Tablo 2'nin ardına yerleştirildi; okuma metni ve
  altyazı eklendi. Metin EPS'in "değerlendirilen" ufku (ürün ömrü) ile
  maddesinin fiilen sürdüğü ufuk (ekolojik zaman) arasındaki farkı
  çerçevenin görünür kıldığı noktaya bağlıyor.
- Tablo 2'deki Terminus aralığı tutarlı sıraya çevrildi:
  Tanımsız -> düzenli depolama -> geri dönüşüm -> biyolojik döngü
  (önceki sıralamada "tanımsız" en sonda duruyordu).
- Dergi listesi: TR Dizin veya Scopus taranan, gönderime açık/kapalı
  dergiler; indeks, ücret, kelime sınırı ve kapsam uyumu ile.

Co-Authored-By: Claude Opus 5 <noreply@anthropic.com>
Claude-Session: https://claude.ai/code/session_014QoKzaqRE4qnMPYFpLQuCd
</commit_message>
<xml_diff>
--- a/biodesign temporality makale/Beyond_Permanence_Temporality_Biodesign_REVISED.docx
+++ b/biodesign temporality makale/Beyond_Permanence_Temporality_Biodesign_REVISED.docx
@@ -2673,7 +2673,7 @@
               <w:rPr>
                 <w:sz w:val="20"/>
               </w:rPr>
-              <w:t>Landfill → recycling stream → biological cycle → no defined terminus</w:t>
+              <w:t>Undefined → landfill → recycling stream → biological cycle</w:t>
             </w:r>
           </w:p>
         </w:tc>
@@ -2701,6 +2701,96 @@
       </w:tr>
     </w:tbl>
     <w:p/>
+    <w:p>
+      <w:pPr>
+        <w:jc w:val="both"/>
+      </w:pPr>
+      <w:r>
+        <w:t xml:space="preserve">Figure 1 works the dimensions through a single comparison. Expanded polystyrene (EPS) protective packaging and its mycelium-composite substitute serve the same function in the same form factor — the substitution Jones et al. (2020) identify as one of the field's most developed industrial applications — which isolates temporal specification from every other variable. The two artefacts separate on all six dimensions, and the separations are not reducible to one another: the shift in </w:t>
+      </w:r>
+      <w:r>
+        <w:rPr>
+          <w:i/>
+        </w:rPr>
+        <w:t>terminus</w:t>
+      </w:r>
+      <w:r>
+        <w:t xml:space="preserve"> is a claim about waste systems, the shift in </w:t>
+      </w:r>
+      <w:r>
+        <w:rPr>
+          <w:i/>
+        </w:rPr>
+        <w:t>distribution of agency</w:t>
+      </w:r>
+      <w:r>
+        <w:t xml:space="preserve"> a claim about who determines form, and neither follows from the other. The figure also makes visible a gap the framework is designed to expose. EPS is </w:t>
+      </w:r>
+      <w:r>
+        <w:rPr>
+          <w:i/>
+        </w:rPr>
+        <w:t>assessed</w:t>
+      </w:r>
+      <w:r>
+        <w:t xml:space="preserve"> at the horizon of product life, but the horizon over which its matter actually persists is ecological — precisely the hyperobject temporality that exceeds ordinary perception and institutional attention (Morton, 2013; Adam, 1998). A framework that records only assessed duration cannot represent that discrepancy; one that separates scale from terminus can.</w:t>
+      </w:r>
+    </w:p>
+    <w:p>
+      <w:pPr>
+        <w:spacing w:before="240" w:after="80"/>
+        <w:jc w:val="center"/>
+      </w:pPr>
+      <w:r>
+        <w:drawing>
+          <wp:inline xmlns:a="http://schemas.openxmlformats.org/drawingml/2006/main" xmlns:pic="http://schemas.openxmlformats.org/drawingml/2006/picture">
+            <wp:extent cx="5486400" cy="4512724"/>
+            <wp:docPr id="1" name="Picture 1"/>
+            <wp:cNvGraphicFramePr>
+              <a:graphicFrameLocks noChangeAspect="1"/>
+            </wp:cNvGraphicFramePr>
+            <a:graphic>
+              <a:graphicData uri="http://schemas.openxmlformats.org/drawingml/2006/picture">
+                <pic:pic>
+                  <pic:nvPicPr>
+                    <pic:cNvPr id="0" name="Figure1_temporal_dimensions.png"/>
+                    <pic:cNvPicPr/>
+                  </pic:nvPicPr>
+                  <pic:blipFill>
+                    <a:blip r:embed="rId9"/>
+                    <a:stretch>
+                      <a:fillRect/>
+                    </a:stretch>
+                  </pic:blipFill>
+                  <pic:spPr>
+                    <a:xfrm>
+                      <a:off x="0" y="0"/>
+                      <a:ext cx="5486400" cy="4512724"/>
+                    </a:xfrm>
+                    <a:prstGeom prst="rect"/>
+                  </pic:spPr>
+                </pic:pic>
+              </a:graphicData>
+            </a:graphic>
+          </wp:inline>
+        </w:drawing>
+      </w:r>
+    </w:p>
+    <w:p>
+      <w:pPr>
+        <w:spacing w:before="200"/>
+        <w:jc w:val="left"/>
+      </w:pPr>
+      <w:r>
+        <w:rPr>
+          <w:b/>
+        </w:rPr>
+        <w:t>Figure 1.</w:t>
+      </w:r>
+      <w:r>
+        <w:t xml:space="preserve"> The six dimensions applied to a single functional substitution: expanded polystyrene (EPS) protective packaging and its mycelium-composite equivalent. Each row is an independent ordinal axis; the heavier segment marks the distance between the two specifications on that axis. Positions are analytical judgements illustrating the framework's discriminating power, not measurements.</w:t>
+      </w:r>
+    </w:p>
     <w:p>
       <w:pPr>
         <w:jc w:val="both"/>

</xml_diff>